<commit_message>
Update ReasoningFlow guide for client-side annotation
</commit_message>
<xml_diff>
--- a/ReasoningFlow with Tool Call and Web Search/ReasoningFlowWithToolCall AnnotationGuide.docx
+++ b/ReasoningFlow with Tool Call and Web Search/ReasoningFlowWithToolCall AnnotationGuide.docx
@@ -24,13 +24,579 @@
           <w:i/>
           <w:sz w:val="18"/>
         </w:rPr>
-        <w:t>Proposed ReasoningFlow annotation supplement | Nathan Conklin | Version 0.1 | 11 October 2026</w:t>
+        <w:t>Proposed ReasoningFlow annotation supplement | Nathan Conklin | Version 0.2 | 12 October 2026</w:t>
+      </w:r>
+    </w:p>
+    <w:p>
+      <w:pPr>
+        <w:pStyle w:val="Heading1"/>
+        <w:keepNext/>
+        <w:pageBreakBefore w:val="0"/>
+        <w:widowControl/>
+      </w:pPr>
+      <w:r>
+        <w:t>A.E0  Implementation update: Client-side annotation without an LLM</w:t>
       </w:r>
     </w:p>
     <w:p>
       <w:pPr>
         <w:pStyle w:val="Heading2"/>
+        <w:keepNext/>
         <w:pageBreakBefore w:val="0"/>
+        <w:widowControl/>
+      </w:pPr>
+      <w:r>
+        <w:t>Design decision and OMI rationale</w:t>
+      </w:r>
+    </w:p>
+    <w:p>
+      <w:pPr>
+        <w:keepNext w:val="0"/>
+        <w:pageBreakBefore w:val="0"/>
+        <w:widowControl/>
+        <w:spacing w:before="0" w:after="120" w:line="257" w:lineRule="auto"/>
+      </w:pPr>
+      <w:r>
+        <w:rPr>
+          <w:rFonts w:ascii="Times New Roman" w:hAnsi="Times New Roman"/>
+          <w:color w:val="000000"/>
+          <w:sz w:val="21"/>
+        </w:rPr>
+        <w:t>The revised implementation computes ReasoningFlow entirely on the client, without an LLM or any other model inference for annotation. The reason for this change is faster OMI feedback: the user should receive node-type coloring and selection feedback without the interface waiting on additional LLM calls. Local processing removes the annotation-request dependency while the primary chat continues to stream. Text rendering remains independent of annotation readiness, and hover and selection read the annotations already held in memory. Faster feedback is the design objective; no measured latency improvement is claimed here.</w:t>
+      </w:r>
+    </w:p>
+    <w:p>
+      <w:pPr>
+        <w:keepNext w:val="0"/>
+        <w:pageBreakBefore w:val="0"/>
+        <w:widowControl/>
+        <w:spacing w:before="0" w:after="120" w:line="257" w:lineRule="auto"/>
+      </w:pPr>
+      <w:r>
+        <w:rPr>
+          <w:rFonts w:ascii="Times New Roman" w:hAnsi="Times New Roman"/>
+          <w:color w:val="000000"/>
+          <w:sz w:val="21"/>
+        </w:rPr>
+        <w:t>The original ReasoningFlow automatic pipeline uses rule-based coarse segmentation followed by LLM-based fine segmentation, node classification, a separate Conclusion update, and incoming-edge annotation for each destination node. This implementation retains the paper's vocabulary but replaces that automated annotation mechanism with deterministic parsing and conservative rules. The paper's annotation results do not validate this replacement. [1, §4.2; Appendix C.1; Appendix I]</w:t>
+      </w:r>
+    </w:p>
+    <w:p>
+      <w:pPr>
+        <w:pStyle w:val="Heading2"/>
+        <w:keepNext/>
+        <w:pageBreakBefore w:val="0"/>
+        <w:widowControl/>
+      </w:pPr>
+      <w:r>
+        <w:t>Processing boundary and unchanged interface</w:t>
+      </w:r>
+    </w:p>
+    <w:p>
+      <w:pPr>
+        <w:keepNext w:val="0"/>
+        <w:pageBreakBefore w:val="0"/>
+        <w:widowControl/>
+        <w:spacing w:before="0" w:after="120" w:line="257" w:lineRule="auto"/>
+      </w:pPr>
+      <w:r>
+        <w:rPr>
+          <w:rFonts w:ascii="Times New Roman" w:hAnsi="Times New Roman"/>
+          <w:color w:val="000000"/>
+          <w:sz w:val="21"/>
+        </w:rPr>
+        <w:t xml:space="preserve">Only ReasoningFlow annotation loses model inference. The application's primary chat generation, streamed </w:t>
+      </w:r>
+      <w:r>
+        <w:rPr>
+          <w:rFonts w:ascii="Courier New" w:hAnsi="Courier New"/>
+          <w:color w:val="000000"/>
+          <w:sz w:val="18"/>
+        </w:rPr>
+        <w:t>reasoning_content</w:t>
+      </w:r>
+      <w:r>
+        <w:rPr>
+          <w:rFonts w:ascii="Times New Roman" w:hAnsi="Times New Roman"/>
+          <w:color w:val="000000"/>
+          <w:sz w:val="21"/>
+        </w:rPr>
+        <w:t>, tool execution, and web-search behavior remain unchanged. Annotation uses ordinary text parsing, lexical comparisons, source mappings, and recorded execution events. It has no LLM fallback, embedding model, learned local classifier, or extra analysis request. Normal loading of saved conversation records is allowed; annotation must not rerun tools or retrieve missing pages.</w:t>
+      </w:r>
+    </w:p>
+    <w:p>
+      <w:pPr>
+        <w:keepNext w:val="0"/>
+        <w:pageBreakBefore w:val="0"/>
+        <w:widowControl/>
+        <w:spacing w:before="0" w:after="120" w:line="257" w:lineRule="auto"/>
+      </w:pPr>
+      <w:r>
+        <w:rPr>
+          <w:rFonts w:ascii="Times New Roman" w:hAnsi="Times New Roman"/>
+          <w:color w:val="000000"/>
+          <w:sz w:val="21"/>
+        </w:rPr>
+        <w:t>The refactor preserves the existing Reasoning Card, its hover highlights, persistent sentence and multi-paragraph selections, mixed-type red outline, synchronized Legend readouts, and approved legend image. All 11 node types and 20 edge labels remain available. Their meanings, colors, box shapes, and line patterns do not change. Different rules may produce different labels or leave more text unclassified; this changes annotation coverage, not the interaction design. The in-memory structure remains named ReasoningFlow and remains reusable by the future Reasoning Tree view.</w:t>
+      </w:r>
+    </w:p>
+    <w:p>
+      <w:pPr>
+        <w:pStyle w:val="Heading2"/>
+        <w:keepNext/>
+        <w:pageBreakBefore w:val="0"/>
+        <w:widowControl/>
+      </w:pPr>
+      <w:r>
+        <w:t>Deterministic node and relationship annotation</w:t>
+      </w:r>
+    </w:p>
+    <w:p>
+      <w:pPr>
+        <w:keepNext w:val="0"/>
+        <w:pageBreakBefore w:val="0"/>
+        <w:widowControl/>
+        <w:spacing w:before="0" w:after="120" w:line="257" w:lineRule="auto"/>
+      </w:pPr>
+      <w:r>
+        <w:rPr>
+          <w:rFonts w:ascii="Times New Roman" w:hAnsi="Times New Roman"/>
+          <w:color w:val="000000"/>
+          <w:sz w:val="21"/>
+        </w:rPr>
+        <w:t xml:space="preserve">Known source identity establishes </w:t>
+      </w:r>
+      <w:r>
+        <w:rPr>
+          <w:rFonts w:ascii="Courier New" w:hAnsi="Courier New"/>
+          <w:color w:val="000000"/>
+          <w:sz w:val="18"/>
+          <w:shd w:val="clear" w:fill="CDEFEF"/>
+        </w:rPr>
+        <w:t>ToolCall</w:t>
+      </w:r>
+      <w:r>
+        <w:rPr>
+          <w:rFonts w:ascii="Times New Roman" w:hAnsi="Times New Roman"/>
+          <w:color w:val="000000"/>
+          <w:sz w:val="21"/>
+        </w:rPr>
+        <w:t xml:space="preserve"> for a recorded request, </w:t>
+      </w:r>
+      <w:r>
+        <w:rPr>
+          <w:rFonts w:ascii="Courier New" w:hAnsi="Courier New"/>
+          <w:color w:val="000000"/>
+          <w:sz w:val="18"/>
+          <w:shd w:val="clear" w:fill="D9E7FC"/>
+        </w:rPr>
+        <w:t>ToolResult</w:t>
+      </w:r>
+      <w:r>
+        <w:rPr>
+          <w:rFonts w:ascii="Times New Roman" w:hAnsi="Times New Roman"/>
+          <w:color w:val="000000"/>
+          <w:sz w:val="21"/>
+        </w:rPr>
+        <w:t xml:space="preserve"> for its observed response, and </w:t>
+      </w:r>
+      <w:r>
+        <w:rPr>
+          <w:rFonts w:ascii="Courier New" w:hAnsi="Courier New"/>
+          <w:color w:val="000000"/>
+          <w:sz w:val="18"/>
+          <w:shd w:val="clear" w:fill="E0E0E0"/>
+        </w:rPr>
+        <w:t>Context</w:t>
+      </w:r>
+      <w:r>
+        <w:rPr>
+          <w:rFonts w:ascii="Times New Roman" w:hAnsi="Times New Roman"/>
+          <w:color w:val="000000"/>
+          <w:sz w:val="21"/>
+        </w:rPr>
+        <w:t xml:space="preserve"> for traceable supplied evidence. Generated reasoning text is classified separately using guarded rules for intentions, evaluations, assumptions, answer assertions, and narrowly recognized restatements or derivations. Rules must account for context, exclusions, and quoted text. A keyword alone does not establish a role; for example, “I think the answer is 17” is not automatically </w:t>
+      </w:r>
+      <w:r>
+        <w:rPr>
+          <w:rFonts w:ascii="Courier New" w:hAnsi="Courier New"/>
+          <w:color w:val="000000"/>
+          <w:sz w:val="18"/>
+          <w:shd w:val="clear" w:fill="A0C4FF"/>
+        </w:rPr>
+        <w:t>Reflection</w:t>
+      </w:r>
+      <w:r>
+        <w:rPr>
+          <w:rFonts w:ascii="Times New Roman" w:hAnsi="Times New Roman"/>
+          <w:color w:val="000000"/>
+          <w:sz w:val="21"/>
+        </w:rPr>
+        <w:t xml:space="preserve">. Unmatched text must not default to </w:t>
+      </w:r>
+      <w:r>
+        <w:rPr>
+          <w:rFonts w:ascii="Courier New" w:hAnsi="Courier New"/>
+          <w:color w:val="000000"/>
+          <w:sz w:val="18"/>
+          <w:shd w:val="clear" w:fill="FDFFB6"/>
+        </w:rPr>
+        <w:t>Reasoning</w:t>
+      </w:r>
+      <w:r>
+        <w:rPr>
+          <w:rFonts w:ascii="Times New Roman" w:hAnsi="Times New Roman"/>
+          <w:color w:val="000000"/>
+          <w:sz w:val="21"/>
+        </w:rPr>
+        <w:t xml:space="preserve"> or </w:t>
+      </w:r>
+      <w:r>
+        <w:rPr>
+          <w:rFonts w:ascii="Courier New" w:hAnsi="Courier New"/>
+          <w:color w:val="000000"/>
+          <w:sz w:val="18"/>
+          <w:shd w:val="clear" w:fill="FFD6A5"/>
+        </w:rPr>
+        <w:t>Fact</w:t>
+      </w:r>
+      <w:r>
+        <w:rPr>
+          <w:rFonts w:ascii="Times New Roman" w:hAnsi="Times New Roman"/>
+          <w:color w:val="000000"/>
+          <w:sz w:val="21"/>
+        </w:rPr>
+        <w:t>.</w:t>
+      </w:r>
+    </w:p>
+    <w:p>
+      <w:pPr>
+        <w:keepNext w:val="0"/>
+        <w:pageBreakBefore w:val="0"/>
+        <w:widowControl/>
+        <w:spacing w:before="0" w:after="120" w:line="257" w:lineRule="auto"/>
+      </w:pPr>
+      <w:r>
+        <w:rPr>
+          <w:rFonts w:ascii="Times New Roman" w:hAnsi="Times New Roman"/>
+          <w:color w:val="000000"/>
+          <w:sz w:val="21"/>
+        </w:rPr>
+        <w:t xml:space="preserve">Call identifiers support </w:t>
+      </w:r>
+      <w:r>
+        <w:rPr>
+          <w:rFonts w:ascii="Courier New" w:hAnsi="Courier New"/>
+          <w:color w:val="000000"/>
+          <w:sz w:val="18"/>
+          <w:shd w:val="clear" w:fill="D8F4F4"/>
+        </w:rPr>
+        <w:t>returns</w:t>
+      </w:r>
+      <w:r>
+        <w:rPr>
+          <w:rFonts w:ascii="Times New Roman" w:hAnsi="Times New Roman"/>
+          <w:color w:val="000000"/>
+          <w:sz w:val="21"/>
+        </w:rPr>
+        <w:t xml:space="preserve">; extraction mappings support </w:t>
+      </w:r>
+      <w:r>
+        <w:rPr>
+          <w:rFonts w:ascii="Courier New" w:hAnsi="Courier New"/>
+          <w:color w:val="000000"/>
+          <w:sz w:val="18"/>
+          <w:shd w:val="clear" w:fill="D8F4F4"/>
+        </w:rPr>
+        <w:t>provides</w:t>
+      </w:r>
+      <w:r>
+        <w:rPr>
+          <w:rFonts w:ascii="Times New Roman" w:hAnsi="Times New Roman"/>
+          <w:color w:val="000000"/>
+          <w:sz w:val="21"/>
+        </w:rPr>
+        <w:t xml:space="preserve">; resolved explicit source references support </w:t>
+      </w:r>
+      <w:r>
+        <w:rPr>
+          <w:rFonts w:ascii="Courier New" w:hAnsi="Courier New"/>
+          <w:color w:val="000000"/>
+          <w:sz w:val="18"/>
+          <w:shd w:val="clear" w:fill="EEDFF8"/>
+        </w:rPr>
+        <w:t>cites</w:t>
+      </w:r>
+      <w:r>
+        <w:rPr>
+          <w:rFonts w:ascii="Times New Roman" w:hAnsi="Times New Roman"/>
+          <w:color w:val="000000"/>
+          <w:sz w:val="21"/>
+        </w:rPr>
+        <w:t xml:space="preserve">; recorded retry lineage supports </w:t>
+      </w:r>
+      <w:r>
+        <w:rPr>
+          <w:rFonts w:ascii="Courier New" w:hAnsi="Courier New"/>
+          <w:color w:val="000000"/>
+          <w:sz w:val="18"/>
+          <w:shd w:val="clear" w:fill="EEDFF8"/>
+        </w:rPr>
+        <w:t>retry_of</w:t>
+      </w:r>
+      <w:r>
+        <w:rPr>
+          <w:rFonts w:ascii="Times New Roman" w:hAnsi="Times New Roman"/>
+          <w:color w:val="000000"/>
+          <w:sz w:val="21"/>
+        </w:rPr>
+        <w:t xml:space="preserve">. Inferred </w:t>
+      </w:r>
+      <w:r>
+        <w:rPr>
+          <w:rFonts w:ascii="Courier New" w:hAnsi="Courier New"/>
+          <w:color w:val="000000"/>
+          <w:sz w:val="18"/>
+          <w:shd w:val="clear" w:fill="D8F4F4"/>
+        </w:rPr>
+        <w:t>invokes</w:t>
+      </w:r>
+      <w:r>
+        <w:rPr>
+          <w:rFonts w:ascii="Times New Roman" w:hAnsi="Times New Roman"/>
+          <w:color w:val="000000"/>
+          <w:sz w:val="21"/>
+        </w:rPr>
+        <w:t xml:space="preserve">, </w:t>
+      </w:r>
+      <w:r>
+        <w:rPr>
+          <w:rFonts w:ascii="Courier New" w:hAnsi="Courier New"/>
+          <w:color w:val="000000"/>
+          <w:sz w:val="18"/>
+          <w:shd w:val="clear" w:fill="EEDFF8"/>
+        </w:rPr>
+        <w:t>grounded_in</w:t>
+      </w:r>
+      <w:r>
+        <w:rPr>
+          <w:rFonts w:ascii="Times New Roman" w:hAnsi="Times New Roman"/>
+          <w:color w:val="000000"/>
+          <w:sz w:val="21"/>
+        </w:rPr>
+        <w:t>, and original semantic edges require a documented rule and supporting evidence. Adjacency, a shared topic, or a citation alone must not create a semantic dependency. Preserve earlier-to-later endpoints and valid multiple labels between the same nodes. Keep uncertain relationships absent rather than forcing a connected graph.</w:t>
+      </w:r>
+    </w:p>
+    <w:p>
+      <w:pPr>
+        <w:pStyle w:val="Heading1"/>
+        <w:keepNext/>
+        <w:pageBreakBefore/>
+        <w:widowControl/>
+      </w:pPr>
+      <w:r>
+        <w:t>A.E0  Client-side annotation without an LLM (continued)</w:t>
+      </w:r>
+    </w:p>
+    <w:p>
+      <w:pPr>
+        <w:pStyle w:val="Heading2"/>
+        <w:keepNext/>
+        <w:pageBreakBefore w:val="0"/>
+        <w:widowControl/>
+      </w:pPr>
+      <w:r>
+        <w:t>Paragraph-triggered streaming and local reconciliation</w:t>
+      </w:r>
+    </w:p>
+    <w:p>
+      <w:pPr>
+        <w:keepNext w:val="0"/>
+        <w:pageBreakBefore w:val="0"/>
+        <w:widowControl/>
+        <w:spacing w:before="0" w:after="120" w:line="257" w:lineRule="auto"/>
+      </w:pPr>
+      <w:r>
+        <w:rPr>
+          <w:rFonts w:ascii="Times New Roman" w:hAnsi="Times New Roman"/>
+          <w:color w:val="000000"/>
+          <w:sz w:val="21"/>
+        </w:rPr>
+        <w:t>Capture incoming text without blocking its display. When a paragraph or supported block is complete, segment it into sentence or justified clause spans, apply role rules, add evidenced relationships, and update the in-memory graph. Paragraphs are scheduling units; they are not automatically single nodes. Protect code and equation blocks, retain an unfinished tail, and preserve exact source offsets. Do not annotate on every token, pause, or mouse event. Structured tool records and directly evidenced associations can update as their events arrive. Use bounded batches or a client-side worker where needed so local analysis does not monopolize the interface thread.</w:t>
+      </w:r>
+    </w:p>
+    <w:p>
+      <w:pPr>
+        <w:keepNext w:val="0"/>
+        <w:pageBreakBefore w:val="0"/>
+        <w:widowControl/>
+        <w:spacing w:before="0" w:after="120" w:line="257" w:lineRule="auto"/>
+      </w:pPr>
+      <w:r>
+        <w:rPr>
+          <w:rFonts w:ascii="Times New Roman" w:hAnsi="Times New Roman"/>
+          <w:color w:val="000000"/>
+          <w:sz w:val="21"/>
+        </w:rPr>
+        <w:t xml:space="preserve">At the authoritative interaction-completion boundary, process the final usable paragraph even without a trailing delimiter. Resolve remaining references, revisit rules whose context has become available, and validate span alignment, endpoint types, chronological availability, and acyclicity. Repair relationships affected by changed nodes; preserve unchanged recorded associations. A pause or tool handoff is not necessarily completion. Cancelled or failed interactions retain their incomplete status. Reconciliation must not import the separate final-answer card, manufacture a </w:t>
+      </w:r>
+      <w:r>
+        <w:rPr>
+          <w:rFonts w:ascii="Courier New" w:hAnsi="Courier New"/>
+          <w:color w:val="000000"/>
+          <w:sz w:val="18"/>
+          <w:shd w:val="clear" w:fill="C3B1E1"/>
+        </w:rPr>
+        <w:t>Conclusion</w:t>
+      </w:r>
+      <w:r>
+        <w:rPr>
+          <w:rFonts w:ascii="Times New Roman" w:hAnsi="Times New Roman"/>
+          <w:color w:val="000000"/>
+          <w:sz w:val="21"/>
+        </w:rPr>
+        <w:t>, or attribute later evidence to an earlier statement.</w:t>
+      </w:r>
+    </w:p>
+    <w:p>
+      <w:pPr>
+        <w:keepNext w:val="0"/>
+        <w:pageBreakBefore w:val="0"/>
+        <w:widowControl/>
+        <w:spacing w:before="0" w:after="120" w:line="257" w:lineRule="auto"/>
+      </w:pPr>
+      <w:r>
+        <w:rPr>
+          <w:rFonts w:ascii="Times New Roman" w:hAnsi="Times New Roman"/>
+          <w:color w:val="000000"/>
+          <w:sz w:val="21"/>
+        </w:rPr>
+        <w:t>This final pass is deterministic completion and consistency checking, not an independent semantic review. Repeating a rule with identical inputs does not correct its systematic errors. Publish a consistent graph revision and preserve selections through source-range mapping when nodes split, merge, or change type. Reject stale results from older generations; hover, clicks, dragging, and Legend display continue to use cached annotations without starting analysis.</w:t>
+      </w:r>
+    </w:p>
+    <w:p>
+      <w:pPr>
+        <w:pStyle w:val="Heading2"/>
+        <w:keepNext/>
+        <w:pageBreakBefore w:val="0"/>
+        <w:widowControl/>
+      </w:pPr>
+      <w:r>
+        <w:t>First-view computation for older conversations</w:t>
+      </w:r>
+    </w:p>
+    <w:p>
+      <w:pPr>
+        <w:keepNext w:val="0"/>
+        <w:pageBreakBefore w:val="0"/>
+        <w:widowControl/>
+        <w:spacing w:before="0" w:after="120" w:line="257" w:lineRule="auto"/>
+      </w:pPr>
+      <w:r>
+        <w:rPr>
+          <w:rFonts w:ascii="Times New Roman" w:hAnsi="Times New Roman"/>
+          <w:color w:val="000000"/>
+          <w:sz w:val="21"/>
+        </w:rPr>
+        <w:t>When an older conversation is selected and saved reasoning has loaded sufficiently for its existing Reasoning Card to be available for viewing, compute any missing ReasoningFlow using the same client-side rules. Process the available completed paragraphs in bounded batches and reconcile the loaded record without waiting for a live completion event. Preserve its original complete, incomplete, or unknown status. Use saved tool and citation records when available; missing records do not justify reconstructed executions, regenerated reasoning, or substituted final-answer text.</w:t>
+      </w:r>
+    </w:p>
+    <w:p>
+      <w:pPr>
+        <w:keepNext w:val="0"/>
+        <w:pageBreakBefore w:val="0"/>
+        <w:widowControl/>
+        <w:spacing w:before="0" w:after="120" w:line="257" w:lineRule="auto"/>
+      </w:pPr>
+      <w:r>
+        <w:rPr>
+          <w:rFonts w:ascii="Times New Roman" w:hAnsi="Times New Roman"/>
+          <w:color w:val="000000"/>
+          <w:sz w:val="21"/>
+        </w:rPr>
+        <w:t>Reuse compatible in-memory results across repeat views and ordinary navigation. Key cached work to the owning conversation/card, source identity or revision, and rule version; deduplicate in-progress work and prevent results from being applied to a different conversation. Do not precompute the entire history library or overwrite saved source content. “First view” applies within the retained cache lifetime; a full application reload or eviction may require recomputation. No new persistent storage is introduced.</w:t>
+      </w:r>
+    </w:p>
+    <w:p>
+      <w:pPr>
+        <w:pStyle w:val="Heading2"/>
+        <w:keepNext/>
+        <w:pageBreakBefore w:val="0"/>
+        <w:widowControl/>
+      </w:pPr>
+      <w:r>
+        <w:t>How to apply the existing annotation guide</w:t>
+      </w:r>
+    </w:p>
+    <w:p>
+      <w:pPr>
+        <w:keepNext w:val="0"/>
+        <w:pageBreakBefore w:val="0"/>
+        <w:widowControl/>
+        <w:spacing w:before="0" w:after="120" w:line="257" w:lineRule="auto"/>
+      </w:pPr>
+      <w:r>
+        <w:rPr>
+          <w:rFonts w:ascii="Times New Roman" w:hAnsi="Times New Roman"/>
+          <w:color w:val="000000"/>
+          <w:sz w:val="21"/>
+        </w:rPr>
+        <w:t xml:space="preserve">The following label definitions, examples, endpoint restrictions, and legend remain the semantic contract. They define a valid annotation, not a guarantee that deterministic rules will identify every instance. In this implementation, “annotator” may refer to a rule-based annotator; </w:t>
+      </w:r>
+      <w:r>
+        <w:rPr>
+          <w:rFonts w:ascii="Courier New" w:hAnsi="Courier New"/>
+          <w:color w:val="000000"/>
+          <w:sz w:val="18"/>
+        </w:rPr>
+        <w:t>annotator_inferred</w:t>
+      </w:r>
+      <w:r>
+        <w:rPr>
+          <w:rFonts w:ascii="Times New Roman" w:hAnsi="Times New Roman"/>
+          <w:color w:val="000000"/>
+          <w:sz w:val="21"/>
+        </w:rPr>
+        <w:t xml:space="preserve"> does not require an LLM. Retain the evidence-method distinctions already defined in this appendix, and identify the responsible rule and version in supporting metadata. Pending or unclassified text is a status, not an additional node type or color; it keeps the default appearance while remaining selectable.</w:t>
+      </w:r>
+    </w:p>
+    <w:p>
+      <w:pPr>
+        <w:keepNext w:val="0"/>
+        <w:pageBreakBefore w:val="0"/>
+        <w:widowControl/>
+        <w:spacing w:before="0" w:after="120" w:line="257" w:lineRule="auto"/>
+      </w:pPr>
+      <w:r>
+        <w:rPr>
+          <w:rFonts w:ascii="Times New Roman" w:hAnsi="Times New Roman"/>
+          <w:color w:val="000000"/>
+          <w:sz w:val="21"/>
+        </w:rPr>
+        <w:t>The expected tradeoff is lower or different semantic coverage in exchange for removing additional model-call latency from OMI feedback. Conservative abstention is preferable to an unsupported color or relationship. Evaluate feedback delay, classification coverage, rule errors, and graph consistency on representative traces. This profile makes no claim of equivalence to the original LLM annotations, measured speedup, or recovery of the model's hidden computational path.</w:t>
+      </w:r>
+    </w:p>
+    <w:p>
+      <w:pPr>
+        <w:keepNext w:val="0"/>
+        <w:pageBreakBefore w:val="0"/>
+        <w:widowControl/>
+        <w:spacing w:before="0" w:after="120" w:line="257" w:lineRule="auto"/>
+      </w:pPr>
+      <w:r>
+        <w:rPr>
+          <w:rFonts w:ascii="Times New Roman" w:hAnsi="Times New Roman"/>
+          <w:i/>
+          <w:color w:val="000000"/>
+          <w:sz w:val="18"/>
+        </w:rPr>
+        <w:t>Design basis: ReasoningFlowClientSideRefactorPlanningPrompt.md, including first-view historical backfill (§§1, 3–10), and the OMI-feedback rationale requested in this conversation. This section supersedes earlier LLM-annotation requirements; the annotation taxonomy below is retained.</w:t>
+      </w:r>
+    </w:p>
+    <w:p>
+      <w:pPr>
+        <w:pStyle w:val="Heading2"/>
+        <w:pageBreakBefore/>
         <w:widowControl/>
       </w:pPr>
       <w:r>

</xml_diff>